<commit_message>
Added Client Spreadsheet for handover
</commit_message>
<xml_diff>
--- a/Sebake/CLIENTS/BRIGHT TRADING AND PROJECTS/Bank Mandate Resolution_SP_BRIGHT_TRADING_AND_PROJECTS.docx
+++ b/Sebake/CLIENTS/BRIGHT TRADING AND PROJECTS/Bank Mandate Resolution_SP_BRIGHT_TRADING_AND_PROJECTS.docx
@@ -239,7 +239,7 @@
           <w:rFonts w:ascii="Arial" w:hAnsi="Arial" w:cs="Arial"/>
           <w:color w:val="auto"/>
         </w:rPr>
-        <w:t xml:space="preserve"> with registration </w:t>
+        <w:t xml:space="preserve"> (Registration No. </w:t>
       </w:r>
       <w:r>
         <w:rPr>
@@ -255,8 +255,9 @@
           <w:rFonts w:ascii="Arial" w:hAnsi="Arial" w:cs="Arial"/>
           <w:color w:val="auto"/>
         </w:rPr>
-        <w:t xml:space="preserve"> we grant permission to our banker to add </w:t>
+        <w:t xml:space="preserve">), we grant permission to our banker to add </w:t>
       </w:r>
+      <w:proofErr w:type="spellStart"/>
       <w:r>
         <w:rPr>
           <w:rFonts w:ascii="Arial" w:hAnsi="Arial" w:cs="Arial"/>
@@ -264,8 +265,19 @@
           <w:bCs/>
           <w:color w:val="auto"/>
         </w:rPr>
-        <w:t xml:space="preserve">Ofentse </w:t>
+        <w:t>Ofentse</w:t>
       </w:r>
+      <w:proofErr w:type="spellEnd"/>
+      <w:r>
+        <w:rPr>
+          <w:rFonts w:ascii="Arial" w:hAnsi="Arial" w:cs="Arial"/>
+          <w:b/>
+          <w:bCs/>
+          <w:color w:val="auto"/>
+        </w:rPr>
+        <w:t xml:space="preserve"> </w:t>
+      </w:r>
+      <w:proofErr w:type="spellStart"/>
       <w:r>
         <w:rPr>
           <w:rFonts w:ascii="Arial" w:hAnsi="Arial" w:cs="Arial"/>
@@ -275,12 +287,13 @@
         </w:rPr>
         <w:t>Nemoshongwa-Phofa</w:t>
       </w:r>
+      <w:proofErr w:type="spellEnd"/>
       <w:r>
         <w:rPr>
           <w:rFonts w:ascii="Arial" w:hAnsi="Arial" w:cs="Arial"/>
           <w:color w:val="auto"/>
         </w:rPr>
-        <w:t xml:space="preserve"> (ID no: </w:t>
+        <w:t xml:space="preserve"> (ID No. </w:t>
       </w:r>
       <w:r>
         <w:rPr>
@@ -289,7 +302,14 @@
           <w:bCs/>
           <w:color w:val="auto"/>
         </w:rPr>
-        <w:t>9502</w:t>
+        <w:t>9502070293085</w:t>
+      </w:r>
+      <w:r>
+        <w:rPr>
+          <w:rFonts w:ascii="Arial" w:hAnsi="Arial" w:cs="Arial"/>
+          <w:color w:val="auto"/>
+        </w:rPr>
+        <w:t xml:space="preserve">) from </w:t>
       </w:r>
       <w:r>
         <w:rPr>
@@ -298,42 +318,14 @@
           <w:bCs/>
           <w:color w:val="auto"/>
         </w:rPr>
-        <w:t>070293085</w:t>
+        <w:t>Mila Azania Holding</w:t>
       </w:r>
       <w:r>
         <w:rPr>
           <w:rFonts w:ascii="Arial" w:hAnsi="Arial" w:cs="Arial"/>
           <w:color w:val="auto"/>
         </w:rPr>
-        <w:t>) from Mila Azania Holding (2015/002533/07) as the sole administrator of our business account:</w:t>
-      </w:r>
-      <w:r>
-        <w:rPr>
-          <w:rFonts w:ascii="Arial" w:hAnsi="Arial" w:cs="Arial"/>
-          <w:color w:val="auto"/>
-        </w:rPr>
-        <w:t xml:space="preserve"> </w:t>
-      </w:r>
-      <w:r>
-        <w:rPr>
-          <w:rFonts w:ascii="Arial" w:hAnsi="Arial" w:cs="Arial"/>
-          <w:color w:val="auto"/>
-        </w:rPr>
-        <w:t>Bank Name: ___________________________, Acc no.: _________________________________ and</w:t>
-      </w:r>
-      <w:r>
-        <w:rPr>
-          <w:rFonts w:ascii="Arial" w:hAnsi="Arial" w:cs="Arial"/>
-          <w:color w:val="auto"/>
-        </w:rPr>
-        <w:t xml:space="preserve"> </w:t>
-      </w:r>
-      <w:r>
-        <w:rPr>
-          <w:rFonts w:ascii="Arial" w:hAnsi="Arial" w:cs="Arial"/>
-          <w:color w:val="auto"/>
-        </w:rPr>
-        <w:t xml:space="preserve">the current administrator(s) </w:t>
+        <w:t xml:space="preserve"> (Registration No. </w:t>
       </w:r>
       <w:r>
         <w:rPr>
@@ -342,28 +334,162 @@
           <w:bCs/>
           <w:color w:val="auto"/>
         </w:rPr>
-        <w:t>NHLANHLA MONDLI BRIGHT THEMBANE</w:t>
+        <w:t>2015/002533/07</w:t>
       </w:r>
       <w:r>
         <w:rPr>
           <w:rFonts w:ascii="Arial" w:hAnsi="Arial" w:cs="Arial"/>
           <w:color w:val="auto"/>
         </w:rPr>
-        <w:t xml:space="preserve"> (ID no:</w:t>
+        <w:t xml:space="preserve">) as the </w:t>
+      </w:r>
+      <w:r>
+        <w:rPr>
+          <w:rFonts w:ascii="Arial" w:hAnsi="Arial" w:cs="Arial"/>
+          <w:b/>
+          <w:bCs/>
+          <w:color w:val="auto"/>
+        </w:rPr>
+        <w:t>sole administrator, sole signatory, and sole internet banking user</w:t>
       </w:r>
       <w:r>
         <w:rPr>
           <w:rFonts w:ascii="Arial" w:hAnsi="Arial" w:cs="Arial"/>
           <w:color w:val="auto"/>
         </w:rPr>
-        <w:t xml:space="preserve"> </w:t>
+        <w:t xml:space="preserve"> of our business account:</w:t>
+      </w:r>
+    </w:p>
+    <w:p>
+      <w:pPr>
+        <w:spacing w:line="360" w:lineRule="auto"/>
+        <w:jc w:val="both"/>
+        <w:rPr>
+          <w:rFonts w:ascii="Arial" w:hAnsi="Arial" w:cs="Arial"/>
+          <w:color w:val="auto"/>
+        </w:rPr>
+      </w:pPr>
+    </w:p>
+    <w:p>
+      <w:pPr>
+        <w:spacing w:line="360" w:lineRule="auto"/>
+        <w:jc w:val="both"/>
+        <w:rPr>
+          <w:rFonts w:ascii="Arial" w:hAnsi="Arial" w:cs="Arial"/>
+          <w:color w:val="auto"/>
+        </w:rPr>
+      </w:pPr>
+      <w:r>
+        <w:rPr>
+          <w:rFonts w:ascii="Arial" w:hAnsi="Arial" w:cs="Arial"/>
+          <w:b/>
+          <w:bCs/>
+          <w:color w:val="auto"/>
+        </w:rPr>
+        <w:t>Bank Name:</w:t>
       </w:r>
       <w:r>
         <w:rPr>
           <w:rFonts w:ascii="Arial" w:hAnsi="Arial" w:cs="Arial"/>
           <w:color w:val="auto"/>
         </w:rPr>
-        <w:t>_____________________) should be removed and delinked for the duration of our project.</w:t>
+        <w:t xml:space="preserve"> ___________________________</w:t>
+      </w:r>
+    </w:p>
+    <w:p>
+      <w:pPr>
+        <w:spacing w:line="360" w:lineRule="auto"/>
+        <w:jc w:val="both"/>
+        <w:rPr>
+          <w:rFonts w:ascii="Arial" w:hAnsi="Arial" w:cs="Arial"/>
+          <w:color w:val="auto"/>
+        </w:rPr>
+      </w:pPr>
+      <w:r>
+        <w:rPr>
+          <w:rFonts w:ascii="Arial" w:hAnsi="Arial" w:cs="Arial"/>
+          <w:b/>
+          <w:bCs/>
+          <w:color w:val="auto"/>
+        </w:rPr>
+        <w:t>Account No.:</w:t>
+      </w:r>
+      <w:r>
+        <w:rPr>
+          <w:rFonts w:ascii="Arial" w:hAnsi="Arial" w:cs="Arial"/>
+          <w:color w:val="auto"/>
+        </w:rPr>
+        <w:t xml:space="preserve"> ___________________________</w:t>
+      </w:r>
+    </w:p>
+    <w:p>
+      <w:pPr>
+        <w:spacing w:line="360" w:lineRule="auto"/>
+        <w:jc w:val="both"/>
+        <w:rPr>
+          <w:rFonts w:ascii="Arial" w:hAnsi="Arial" w:cs="Arial"/>
+          <w:color w:val="auto"/>
+        </w:rPr>
+      </w:pPr>
+    </w:p>
+    <w:p>
+      <w:pPr>
+        <w:spacing w:line="360" w:lineRule="auto"/>
+        <w:jc w:val="both"/>
+        <w:rPr>
+          <w:rFonts w:ascii="Arial" w:hAnsi="Arial" w:cs="Arial"/>
+          <w:color w:val="auto"/>
+        </w:rPr>
+      </w:pPr>
+      <w:r>
+        <w:rPr>
+          <w:rFonts w:ascii="Arial" w:hAnsi="Arial" w:cs="Arial"/>
+          <w:color w:val="auto"/>
+        </w:rPr>
+        <w:t xml:space="preserve">Furthermore, the current administrator(s), </w:t>
+      </w:r>
+      <w:r>
+        <w:rPr>
+          <w:rFonts w:ascii="Arial" w:hAnsi="Arial" w:cs="Arial"/>
+          <w:b/>
+          <w:bCs/>
+          <w:color w:val="auto"/>
+        </w:rPr>
+        <w:t xml:space="preserve">Nhlanhla Mondli Bright </w:t>
+      </w:r>
+      <w:proofErr w:type="spellStart"/>
+      <w:r>
+        <w:rPr>
+          <w:rFonts w:ascii="Arial" w:hAnsi="Arial" w:cs="Arial"/>
+          <w:b/>
+          <w:bCs/>
+          <w:color w:val="auto"/>
+        </w:rPr>
+        <w:t>Thembane</w:t>
+      </w:r>
+      <w:proofErr w:type="spellEnd"/>
+      <w:r>
+        <w:rPr>
+          <w:rFonts w:ascii="Arial" w:hAnsi="Arial" w:cs="Arial"/>
+          <w:color w:val="auto"/>
+        </w:rPr>
+        <w:t xml:space="preserve"> (ID No. _____________________), must be </w:t>
+      </w:r>
+      <w:r>
+        <w:rPr>
+          <w:rFonts w:ascii="Arial" w:hAnsi="Arial" w:cs="Arial"/>
+          <w:b/>
+          <w:bCs/>
+          <w:color w:val="auto"/>
+        </w:rPr>
+        <w:t>removed and delinked</w:t>
+      </w:r>
+      <w:r>
+        <w:rPr>
+          <w:rFonts w:ascii="Arial" w:hAnsi="Arial" w:cs="Arial"/>
+          <w:color w:val="auto"/>
+        </w:rPr>
+        <w:t xml:space="preserve"> from the account for the duration of our project.</w:t>
       </w:r>
     </w:p>
     <w:p>
@@ -507,8 +633,21 @@
                                 <w:szCs w:val="22"/>
                                 <w:lang w:val="en-US"/>
                               </w:rPr>
-                              <w:t>Bright N.M. Thembane</w:t>
+                              <w:t xml:space="preserve">Bright N.M. </w:t>
                             </w:r>
+                            <w:proofErr w:type="spellStart"/>
+                            <w:r>
+                              <w:rPr>
+                                <w:rFonts w:ascii="Courier New" w:hAnsi="Courier New" w:cs="Courier New"/>
+                                <w:b/>
+                                <w:bCs/>
+                                <w:sz w:val="22"/>
+                                <w:szCs w:val="22"/>
+                                <w:lang w:val="en-US"/>
+                              </w:rPr>
+                              <w:t>Thembane</w:t>
+                            </w:r>
+                            <w:proofErr w:type="spellEnd"/>
                           </w:p>
                           <w:p>
                             <w:pPr>
@@ -633,8 +772,21 @@
                           <w:szCs w:val="22"/>
                           <w:lang w:val="en-US"/>
                         </w:rPr>
-                        <w:t>Bright N.M. Thembane</w:t>
+                        <w:t xml:space="preserve">Bright N.M. </w:t>
                       </w:r>
+                      <w:proofErr w:type="spellStart"/>
+                      <w:r>
+                        <w:rPr>
+                          <w:rFonts w:ascii="Courier New" w:hAnsi="Courier New" w:cs="Courier New"/>
+                          <w:b/>
+                          <w:bCs/>
+                          <w:sz w:val="22"/>
+                          <w:szCs w:val="22"/>
+                          <w:lang w:val="en-US"/>
+                        </w:rPr>
+                        <w:t>Thembane</w:t>
+                      </w:r>
+                      <w:proofErr w:type="spellEnd"/>
                     </w:p>
                     <w:p>
                       <w:pPr>
@@ -1023,7 +1175,27 @@
                                 <w:szCs w:val="16"/>
                                 <w:lang w:val="en-US"/>
                               </w:rPr>
-                              <w:t>AA 39 Katushi Avenue</w:t>
+                              <w:t xml:space="preserve">AA 39 </w:t>
+                            </w:r>
+                            <w:proofErr w:type="spellStart"/>
+                            <w:r>
+                              <w:rPr>
+                                <w:rFonts w:ascii="Courier New" w:hAnsi="Courier New" w:cs="Courier New"/>
+                                <w:sz w:val="16"/>
+                                <w:szCs w:val="16"/>
+                                <w:lang w:val="en-US"/>
+                              </w:rPr>
+                              <w:t>Katushi</w:t>
+                            </w:r>
+                            <w:proofErr w:type="spellEnd"/>
+                            <w:r>
+                              <w:rPr>
+                                <w:rFonts w:ascii="Courier New" w:hAnsi="Courier New" w:cs="Courier New"/>
+                                <w:sz w:val="16"/>
+                                <w:szCs w:val="16"/>
+                                <w:lang w:val="en-US"/>
+                              </w:rPr>
+                              <w:t xml:space="preserve"> Avenue</w:t>
                             </w:r>
                           </w:p>
                           <w:p>
@@ -1195,7 +1367,27 @@
                           <w:szCs w:val="16"/>
                           <w:lang w:val="en-US"/>
                         </w:rPr>
-                        <w:t>AA 39 Katushi Avenue</w:t>
+                        <w:t xml:space="preserve">AA 39 </w:t>
+                      </w:r>
+                      <w:proofErr w:type="spellStart"/>
+                      <w:r>
+                        <w:rPr>
+                          <w:rFonts w:ascii="Courier New" w:hAnsi="Courier New" w:cs="Courier New"/>
+                          <w:sz w:val="16"/>
+                          <w:szCs w:val="16"/>
+                          <w:lang w:val="en-US"/>
+                        </w:rPr>
+                        <w:t>Katushi</w:t>
+                      </w:r>
+                      <w:proofErr w:type="spellEnd"/>
+                      <w:r>
+                        <w:rPr>
+                          <w:rFonts w:ascii="Courier New" w:hAnsi="Courier New" w:cs="Courier New"/>
+                          <w:sz w:val="16"/>
+                          <w:szCs w:val="16"/>
+                          <w:lang w:val="en-US"/>
+                        </w:rPr>
+                        <w:t xml:space="preserve"> Avenue</w:t>
                       </w:r>
                     </w:p>
                     <w:p>
@@ -8197,7 +8389,6 @@
   <w:style w:type="character" w:default="1" w:styleId="DefaultParagraphFont">
     <w:name w:val="Default Paragraph Font"/>
     <w:uiPriority w:val="1"/>
-    <w:semiHidden/>
     <w:unhideWhenUsed/>
   </w:style>
   <w:style w:type="table" w:default="1" w:styleId="TableNormal">

</xml_diff>